<commit_message>
CH-34/35/36: outbox keys, privacy coarsened-point wording, rebuilt lawyer docx + builder
Co-Authored-By: Claude Sonnet 5.5 <noreply@anthropic.com>
</commit_message>
<xml_diff>
--- a/docs/legal/najdimo-pravni-pregled.docx
+++ b/docs/legal/najdimo-pravni-pregled.docx
@@ -309,7 +309,7 @@
                 <w:sz w:val="18"/>
                 <w:szCs w:val="18"/>
               </w:rPr>
-              <w:t xml:space="preserve">0.2 (posredovanje nagrad izločeno iz obsega; slovenska različica)</w:t>
+              <w:t xml:space="preserve">0.3 (zmanjšanje natančnosti lokacije)</w:t>
             </w:r>
           </w:p>
         </w:tc>
@@ -4694,7 +4694,7 @@
                 <w:sz w:val="16"/>
                 <w:szCs w:val="16"/>
               </w:rPr>
-              <w:t xml:space="preserve">Točna točka (pogosto blizu lastnikovega doma), javna točka in polmer, občina in regija</w:t>
+              <w:t xml:space="preserve">Premaknjena točka (20 do 30 m od prave lege, pogosto blizu lastnikovega doma), javna točka in polmer, občina in regija</w:t>
             </w:r>
           </w:p>
         </w:tc>
@@ -4726,7 +4726,7 @@
                 <w:sz w:val="16"/>
                 <w:szCs w:val="16"/>
               </w:rPr>
-              <w:t xml:space="preserve">Izgubljena žival: polmer najmanj 500 m, najdena in opažena: najmanj 150 m; zameglitev je za vsako prijavo enaka, zato ponovni ogledi ne razkrijejo središča; točno točko vidi samo prijavitelj ali sogovornik v pogovoru, če mu jo prijavitelj pokaže; kje je najdena žival, nikoli ne sprašujemo</w:t>
+              <w:t xml:space="preserve">Izgubljena žival: polmer najmanj 500 m, najdena in opažena: najmanj 150 m; zameglitev je za vsako prijavo enaka, zato ponovni ogledi ne razkrijejo središča; surove točke GPS nikoli ne shranjujemo: naključni premik za 20 do 30 m se uporabi enkrat ob shranjevanju, v napravi in še enkrat na strežniku, shranjena točka se nikoli ne ponovno naključno spremeni; javna zameglitev izhaja iz te premaknjene točke; shranjeno točko vidi samo prijavitelj (označeno »približno«) ali sogovornik v pogovoru, če mu jo prijavitelj pokaže; 30 dni po zaključku se shranjena točka dodatno zamegli (N je predlog, LQ-19); koordinat ne zapisujemo v dnevnike; kje je najdena žival, nikoli ne sprašujemo</w:t>
             </w:r>
           </w:p>
         </w:tc>
@@ -18738,7 +18738,7 @@
                 <w:sz w:val="16"/>
                 <w:szCs w:val="16"/>
               </w:rPr>
-              <w:t xml:space="preserve">Hramba: ali so roki iz poglavja 8 sprejemljivi? Zlasti: kaj ostane od zaključene prijave po 12 mesecih, 24 mesecev za prijave zlorab in revizijski dnevnik ter 10 let za plačilne zapise.</w:t>
+              <w:t xml:space="preserve">Hramba: ali so roki iz poglavja 8 sprejemljivi? Zlasti: kaj ostane od zaključene prijave po 12 mesecih, 24 mesecev za prijave zlorab in revizijski dnevnik ter 10 let za plačilne zapise. Še: ali je 30 dni po zaključku sprejemljiv rok za zameglitev shranjene točke (surove točke ne shranjujemo; ob shranjevanju jo premaknemo za 20 do 30 m)?</w:t>
             </w:r>
           </w:p>
         </w:tc>
@@ -18770,7 +18770,7 @@
                 <w:sz w:val="16"/>
                 <w:szCs w:val="16"/>
               </w:rPr>
-              <w:t xml:space="preserve">Poglavje 8, kot je predlagano. Po 12 mesecih zaključena prijava izgubi fotografije, točno točko in prosto besedilo; preostala polja niso več povezana z računom in jih hranimo samo za statistiko.</w:t>
+              <w:t xml:space="preserve">Poglavje 8, kot je predlagano. Shranjena točka se zamegli 30 dni po zaključku (predlagani N; potrdite). Po 12 mesecih zaključena prijava izgubi fotografije, točno točko in prosto besedilo; preostala polja niso več povezana z računom in jih hranimo samo za statistiko.</w:t>
             </w:r>
           </w:p>
         </w:tc>
@@ -29983,7 +29983,7 @@
                 <w:sz w:val="16"/>
                 <w:szCs w:val="16"/>
               </w:rPr>
-              <w:t xml:space="preserve">Javno območje s polmerom najmanj 500 m, enaka zameglitev ob vsakem ogledu, točna točka vidna samo prijavitelju, točne točke nikoli v predpomnilniku za delo brez povezave, analitiki ali slikah za deljenje in nikoli poslane tretji osebi (lasten geokodirnik)</w:t>
+              <w:t xml:space="preserve">Surova točka GPS se nikoli ne shrani (naključni premik za 20 do 30 m enkrat ob shranjevanju, v napravi in na strežniku), javno območje s polmerom najmanj 500 m iz premaknjene točke, enaka zameglitev ob vsakem ogledu, premaknjena točka vidna samo prijavitelju in 30 dni po zaključku dodatno zameglena, koordinat ni v dnevnikih, točke nikoli v predpomnilniku za delo brez povezave, analitiki ali slikah za deljenje in nikoli poslane tretji osebi (lasten geokodirnik)</w:t>
             </w:r>
           </w:p>
         </w:tc>
@@ -33334,7 +33334,173 @@
                 <w:sz w:val="16"/>
                 <w:szCs w:val="16"/>
               </w:rPr>
-              <w:t xml:space="preserve">Zaključene prijave: fotografije, točna točka, prosto besedilo</w:t>
+              <w:t xml:space="preserve">Zaključene prijave: shranjena točka (že premaknjena za 20 do 30 m ob shranjevanju)</w:t>
+            </w:r>
+          </w:p>
+        </w:tc>
+        <w:tc>
+          <w:tcPr>
+            <w:tcW w:type="dxa" w:w="1060"/>
+            <w:tcBorders>
+              <w:top w:val="single" w:color="A6B4B9" w:sz="4"/>
+              <w:left w:val="single" w:color="A6B4B9" w:sz="4"/>
+              <w:bottom w:val="single" w:color="A6B4B9" w:sz="4"/>
+              <w:right w:val="single" w:color="A6B4B9" w:sz="4"/>
+            </w:tcBorders>
+            <w:tcMar>
+              <w:top w:type="dxa" w:w="50"/>
+              <w:left w:type="dxa" w:w="90"/>
+              <w:bottom w:type="dxa" w:w="50"/>
+              <w:right w:type="dxa" w:w="90"/>
+            </w:tcMar>
+            <w:vAlign w:val="top"/>
+          </w:tcPr>
+          <w:p>
+            <w:pPr>
+              <w:spacing w:before="0" w:after="0" w:line="252"/>
+              <w:jc w:val="left"/>
+            </w:pPr>
+            <w:r>
+              <w:rPr>
+                <w:color w:val="1A1A1A"/>
+                <w:sz w:val="16"/>
+                <w:szCs w:val="16"/>
+              </w:rPr>
+              <w:t xml:space="preserve">Supabase</w:t>
+            </w:r>
+          </w:p>
+        </w:tc>
+        <w:tc>
+          <w:tcPr>
+            <w:tcW w:type="dxa" w:w="3180"/>
+            <w:tcBorders>
+              <w:top w:val="single" w:color="A6B4B9" w:sz="4"/>
+              <w:left w:val="single" w:color="A6B4B9" w:sz="4"/>
+              <w:bottom w:val="single" w:color="A6B4B9" w:sz="4"/>
+              <w:right w:val="single" w:color="A6B4B9" w:sz="4"/>
+            </w:tcBorders>
+            <w:tcMar>
+              <w:top w:type="dxa" w:w="50"/>
+              <w:left w:type="dxa" w:w="90"/>
+              <w:bottom w:type="dxa" w:w="50"/>
+              <w:right w:type="dxa" w:w="90"/>
+            </w:tcMar>
+            <w:vAlign w:val="top"/>
+          </w:tcPr>
+          <w:p>
+            <w:pPr>
+              <w:spacing w:before="0" w:after="0" w:line="252"/>
+              <w:jc w:val="left"/>
+            </w:pPr>
+            <w:r>
+              <w:rPr>
+                <w:color w:val="1A1A1A"/>
+                <w:sz w:val="16"/>
+                <w:szCs w:val="16"/>
+              </w:rPr>
+              <w:t xml:space="preserve">Zamegljena 30 dni po zaključku (predlagani N, LQ-19); ostaneta samo zamegljena točka in ime območja</w:t>
+            </w:r>
+          </w:p>
+        </w:tc>
+        <w:tc>
+          <w:tcPr>
+            <w:tcW w:type="dxa" w:w="1542"/>
+            <w:tcBorders>
+              <w:top w:val="single" w:color="A6B4B9" w:sz="4"/>
+              <w:left w:val="single" w:color="A6B4B9" w:sz="4"/>
+              <w:bottom w:val="single" w:color="A6B4B9" w:sz="4"/>
+              <w:right w:val="single" w:color="A6B4B9" w:sz="4"/>
+            </w:tcBorders>
+            <w:tcMar>
+              <w:top w:type="dxa" w:w="50"/>
+              <w:left w:type="dxa" w:w="90"/>
+              <w:bottom w:type="dxa" w:w="50"/>
+              <w:right w:type="dxa" w:w="90"/>
+            </w:tcMar>
+            <w:vAlign w:val="top"/>
+          </w:tcPr>
+          <w:p>
+            <w:pPr>
+              <w:spacing w:before="0" w:after="0" w:line="252"/>
+              <w:jc w:val="left"/>
+            </w:pPr>
+            <w:r>
+              <w:rPr>
+                <w:color w:val="1A1A1A"/>
+                <w:sz w:val="16"/>
+                <w:szCs w:val="16"/>
+              </w:rPr>
+              <w:t xml:space="preserve">Opravilo hrambe</w:t>
+            </w:r>
+          </w:p>
+        </w:tc>
+        <w:tc>
+          <w:tcPr>
+            <w:tcW w:type="dxa" w:w="1543"/>
+            <w:tcBorders>
+              <w:top w:val="single" w:color="A6B4B9" w:sz="4"/>
+              <w:left w:val="single" w:color="A6B4B9" w:sz="4"/>
+              <w:bottom w:val="single" w:color="A6B4B9" w:sz="4"/>
+              <w:right w:val="single" w:color="A6B4B9" w:sz="4"/>
+            </w:tcBorders>
+            <w:tcMar>
+              <w:top w:type="dxa" w:w="50"/>
+              <w:left w:type="dxa" w:w="90"/>
+              <w:bottom w:type="dxa" w:w="50"/>
+              <w:right w:type="dxa" w:w="90"/>
+            </w:tcMar>
+            <w:vAlign w:val="top"/>
+          </w:tcPr>
+          <w:p>
+            <w:pPr>
+              <w:spacing w:before="0" w:after="0" w:line="252"/>
+              <w:jc w:val="left"/>
+            </w:pPr>
+            <w:r>
+              <w:rPr>
+                <w:color w:val="1A1A1A"/>
+                <w:sz w:val="16"/>
+                <w:szCs w:val="16"/>
+              </w:rPr>
+              <w:t xml:space="preserve">Ne (dodati)</w:t>
+            </w:r>
+          </w:p>
+        </w:tc>
+      </w:tr>
+      <w:tr>
+        <w:trPr>
+          <w:cantSplit/>
+          <w:tblHeader w:val="false"/>
+        </w:trPr>
+        <w:tc>
+          <w:tcPr>
+            <w:tcW w:type="dxa" w:w="2313"/>
+            <w:tcBorders>
+              <w:top w:val="single" w:color="A6B4B9" w:sz="4"/>
+              <w:left w:val="single" w:color="A6B4B9" w:sz="4"/>
+              <w:bottom w:val="single" w:color="A6B4B9" w:sz="4"/>
+              <w:right w:val="single" w:color="A6B4B9" w:sz="4"/>
+            </w:tcBorders>
+            <w:tcMar>
+              <w:top w:type="dxa" w:w="50"/>
+              <w:left w:type="dxa" w:w="90"/>
+              <w:bottom w:type="dxa" w:w="50"/>
+              <w:right w:type="dxa" w:w="90"/>
+            </w:tcMar>
+            <w:vAlign w:val="top"/>
+          </w:tcPr>
+          <w:p>
+            <w:pPr>
+              <w:spacing w:before="0" w:after="0" w:line="252"/>
+              <w:jc w:val="left"/>
+            </w:pPr>
+            <w:r>
+              <w:rPr>
+                <w:color w:val="1A1A1A"/>
+                <w:sz w:val="16"/>
+                <w:szCs w:val="16"/>
+              </w:rPr>
+              <w:t xml:space="preserve">Zaključene prijave: fotografije, točka, prosto besedilo</w:t>
             </w:r>
           </w:p>
         </w:tc>
@@ -45901,6 +46067,108 @@
                 <w:szCs w:val="18"/>
               </w:rPr>
               <w:t xml:space="preserve">).</w:t>
+            </w:r>
+          </w:p>
+        </w:tc>
+      </w:tr>
+      <w:tr>
+        <w:trPr>
+          <w:cantSplit/>
+          <w:tblHeader w:val="false"/>
+        </w:trPr>
+        <w:tc>
+          <w:tcPr>
+            <w:tcW w:type="dxa" w:w="1156"/>
+            <w:tcBorders>
+              <w:top w:val="single" w:color="A6B4B9" w:sz="4"/>
+              <w:left w:val="single" w:color="A6B4B9" w:sz="4"/>
+              <w:bottom w:val="single" w:color="A6B4B9" w:sz="4"/>
+              <w:right w:val="single" w:color="A6B4B9" w:sz="4"/>
+            </w:tcBorders>
+            <w:tcMar>
+              <w:top w:type="dxa" w:w="50"/>
+              <w:left w:type="dxa" w:w="90"/>
+              <w:bottom w:type="dxa" w:w="50"/>
+              <w:right w:type="dxa" w:w="90"/>
+            </w:tcMar>
+            <w:vAlign w:val="top"/>
+          </w:tcPr>
+          <w:p>
+            <w:pPr>
+              <w:spacing w:before="0" w:after="0" w:line="252"/>
+              <w:jc w:val="left"/>
+            </w:pPr>
+            <w:r>
+              <w:rPr>
+                <w:color w:val="1A1A1A"/>
+                <w:sz w:val="18"/>
+                <w:szCs w:val="18"/>
+              </w:rPr>
+              <w:t xml:space="preserve">0.3</w:t>
+            </w:r>
+          </w:p>
+        </w:tc>
+        <w:tc>
+          <w:tcPr>
+            <w:tcW w:type="dxa" w:w="1542"/>
+            <w:tcBorders>
+              <w:top w:val="single" w:color="A6B4B9" w:sz="4"/>
+              <w:left w:val="single" w:color="A6B4B9" w:sz="4"/>
+              <w:bottom w:val="single" w:color="A6B4B9" w:sz="4"/>
+              <w:right w:val="single" w:color="A6B4B9" w:sz="4"/>
+            </w:tcBorders>
+            <w:tcMar>
+              <w:top w:type="dxa" w:w="50"/>
+              <w:left w:type="dxa" w:w="90"/>
+              <w:bottom w:type="dxa" w:w="50"/>
+              <w:right w:type="dxa" w:w="90"/>
+            </w:tcMar>
+            <w:vAlign w:val="top"/>
+          </w:tcPr>
+          <w:p>
+            <w:pPr>
+              <w:spacing w:before="0" w:after="0" w:line="252"/>
+              <w:jc w:val="left"/>
+            </w:pPr>
+            <w:r>
+              <w:rPr>
+                <w:color w:val="1A1A1A"/>
+                <w:sz w:val="18"/>
+                <w:szCs w:val="18"/>
+              </w:rPr>
+              <w:t xml:space="preserve">15. 10. 2026</w:t>
+            </w:r>
+          </w:p>
+        </w:tc>
+        <w:tc>
+          <w:tcPr>
+            <w:tcW w:type="dxa" w:w="6940"/>
+            <w:tcBorders>
+              <w:top w:val="single" w:color="A6B4B9" w:sz="4"/>
+              <w:left w:val="single" w:color="A6B4B9" w:sz="4"/>
+              <w:bottom w:val="single" w:color="A6B4B9" w:sz="4"/>
+              <w:right w:val="single" w:color="A6B4B9" w:sz="4"/>
+            </w:tcBorders>
+            <w:tcMar>
+              <w:top w:type="dxa" w:w="50"/>
+              <w:left w:type="dxa" w:w="90"/>
+              <w:bottom w:type="dxa" w:w="50"/>
+              <w:right w:type="dxa" w:w="90"/>
+            </w:tcMar>
+            <w:vAlign w:val="top"/>
+          </w:tcPr>
+          <w:p>
+            <w:pPr>
+              <w:spacing w:before="0" w:after="0" w:line="252"/>
+              <w:jc w:val="left"/>
+            </w:pPr>
+            <w:r>
+              <w:rPr>
+                <w:color w:val="1A1A1A"/>
+                <w:sz w:val="18"/>
+                <w:szCs w:val="18"/>
+              </w:rPr>
+              <w:t xml:space="preserve">Zmanjšanje natančnosti lokacije (odločitev naročnika): surove točke GPS ne shranjujemo; naključni premik za 20 do 30 m enkrat ob shranjevanju, v napravi in na strežniku; javna zameglitev (500 m / 150 m) izhaja iz premaknjene točke; shranjena točka se zamegli 30 dni po zaključku (predlagani N). Spremenjeno: F-03, LQ-19, ocena učinka D-01, poglavje 8. Politika zasebnosti 0.5.</w:t>
             </w:r>
           </w:p>
         </w:tc>

</xml_diff>